<commit_message>
updating answers docx and pdf
</commit_message>
<xml_diff>
--- a/EECS_738_machine_learning/lab2/answer.docx
+++ b/EECS_738_machine_learning/lab2/answer.docx
@@ -72,7 +72,20 @@
         <w:rPr>
           <w:rFonts w:ascii="Calibri" w:hAnsi="Calibri" w:cs="Calibri"/>
         </w:rPr>
-        <w:t xml:space="preserve"> Some preprocessing and feature engineering process are done beforehand:</w:t>
+        <w:t xml:space="preserve"> Some preprocessing and feature engineering process</w:t>
+      </w:r>
+      <w:r>
+        <w:rPr>
+          <w:rFonts w:ascii="Calibri" w:hAnsi="Calibri" w:cs="Calibri"/>
+          <w:lang w:val="en-US"/>
+        </w:rPr>
+        <w:t>es</w:t>
+      </w:r>
+      <w:r>
+        <w:rPr>
+          <w:rFonts w:ascii="Calibri" w:hAnsi="Calibri" w:cs="Calibri"/>
+        </w:rPr>
+        <w:t xml:space="preserve"> are done beforehand:</w:t>
       </w:r>
     </w:p>
     <w:p>
@@ -89,8 +102,67 @@
       <w:r>
         <w:rPr>
           <w:rFonts w:ascii="Calibri" w:hAnsi="Calibri" w:cs="Calibri"/>
-        </w:rPr>
-        <w:t>label encoding month and day column</w:t>
+          <w:lang w:val="en-US"/>
+        </w:rPr>
+        <w:t xml:space="preserve">apply </w:t>
+      </w:r>
+      <w:r>
+        <w:rPr>
+          <w:rFonts w:ascii="Calibri" w:hAnsi="Calibri" w:cs="Calibri"/>
+        </w:rPr>
+        <w:t xml:space="preserve">label encoding </w:t>
+      </w:r>
+      <w:r>
+        <w:rPr>
+          <w:rFonts w:ascii="Calibri" w:hAnsi="Calibri" w:cs="Calibri"/>
+          <w:lang w:val="en-US"/>
+        </w:rPr>
+        <w:t>on the “</w:t>
+      </w:r>
+      <w:r>
+        <w:rPr>
+          <w:rFonts w:ascii="Calibri" w:hAnsi="Calibri" w:cs="Calibri"/>
+        </w:rPr>
+        <w:t>month</w:t>
+      </w:r>
+      <w:r>
+        <w:rPr>
+          <w:rFonts w:ascii="Calibri" w:hAnsi="Calibri" w:cs="Calibri"/>
+          <w:lang w:val="en-US"/>
+        </w:rPr>
+        <w:t>”</w:t>
+      </w:r>
+      <w:r>
+        <w:rPr>
+          <w:rFonts w:ascii="Calibri" w:hAnsi="Calibri" w:cs="Calibri"/>
+        </w:rPr>
+        <w:t xml:space="preserve"> and </w:t>
+      </w:r>
+      <w:r>
+        <w:rPr>
+          <w:rFonts w:ascii="Calibri" w:hAnsi="Calibri" w:cs="Calibri"/>
+          <w:lang w:val="en-US"/>
+        </w:rPr>
+        <w:t>“</w:t>
+      </w:r>
+      <w:r>
+        <w:rPr>
+          <w:rFonts w:ascii="Calibri" w:hAnsi="Calibri" w:cs="Calibri"/>
+        </w:rPr>
+        <w:t>day</w:t>
+      </w:r>
+      <w:r>
+        <w:rPr>
+          <w:rFonts w:ascii="Calibri" w:hAnsi="Calibri" w:cs="Calibri"/>
+          <w:lang w:val="en-US"/>
+        </w:rPr>
+        <w:t>”</w:t>
+      </w:r>
+      <w:r>
+        <w:rPr>
+          <w:rFonts w:ascii="Calibri" w:hAnsi="Calibri" w:cs="Calibri"/>
+        </w:rPr>
+        <w:t xml:space="preserve"> column</w:t>
       </w:r>
     </w:p>
     <w:p>
@@ -108,7 +180,20 @@
         <w:rPr>
           <w:rFonts w:ascii="Calibri" w:hAnsi="Calibri" w:cs="Calibri"/>
         </w:rPr>
-        <w:t>take the log of area column</w:t>
+        <w:t>take the log</w:t>
+      </w:r>
+      <w:r>
+        <w:rPr>
+          <w:rFonts w:ascii="Calibri" w:hAnsi="Calibri" w:cs="Calibri"/>
+          <w:lang w:val="en-US"/>
+        </w:rPr>
+        <w:t>arithm</w:t>
+      </w:r>
+      <w:r>
+        <w:rPr>
+          <w:rFonts w:ascii="Calibri" w:hAnsi="Calibri" w:cs="Calibri"/>
+        </w:rPr>
+        <w:t xml:space="preserve"> of area column</w:t>
       </w:r>
     </w:p>
     <w:p>
@@ -126,7 +211,7 @@
         <w:rPr>
           <w:rFonts w:ascii="Calibri" w:hAnsi="Calibri" w:cs="Calibri"/>
         </w:rPr>
-        <w:t xml:space="preserve">cutting the </w:t>
+        <w:t xml:space="preserve">cut the </w:t>
       </w:r>
       <w:r>
         <w:rPr>
@@ -294,6 +379,7 @@
       <w:pPr>
         <w:rPr>
           <w:rFonts w:ascii="Calibri" w:hAnsi="Calibri" w:cs="Calibri"/>
+          <w:lang w:val="en-US"/>
         </w:rPr>
       </w:pPr>
       <w:r>
@@ -307,6 +393,13 @@
           <w:rFonts w:ascii="Calibri" w:hAnsi="Calibri" w:cs="Calibri"/>
         </w:rPr>
         <w:t xml:space="preserve"> Besides, I also self-implemented 2 functions to calculate sensitivity and specificity matrix for multi-label classification</w:t>
+      </w:r>
+      <w:r>
+        <w:rPr>
+          <w:rFonts w:ascii="Calibri" w:hAnsi="Calibri" w:cs="Calibri"/>
+          <w:lang w:val="en-US"/>
+        </w:rPr>
+        <w:t>.</w:t>
       </w:r>
     </w:p>
     <w:p>
@@ -343,7 +436,20 @@
         <w:rPr>
           <w:rFonts w:ascii="Calibri" w:hAnsi="Calibri" w:cs="Calibri"/>
         </w:rPr>
-        <w:t xml:space="preserve">I start with a simple decision tree </w:t>
+        <w:t>I start</w:t>
+      </w:r>
+      <w:r>
+        <w:rPr>
+          <w:rFonts w:ascii="Calibri" w:hAnsi="Calibri" w:cs="Calibri"/>
+          <w:lang w:val="en-US"/>
+        </w:rPr>
+        <w:t>ed</w:t>
+      </w:r>
+      <w:r>
+        <w:rPr>
+          <w:rFonts w:ascii="Calibri" w:hAnsi="Calibri" w:cs="Calibri"/>
+        </w:rPr>
+        <w:t xml:space="preserve"> with a simple decision tree </w:t>
       </w:r>
       <w:r>
         <w:rPr>
@@ -590,7 +696,20 @@
           <w:rFonts w:ascii="Calibri" w:hAnsi="Calibri" w:cs="Calibri"/>
         </w:rPr>
         <w:lastRenderedPageBreak/>
-        <w:t>I started with an important parameter: max_depth which controls the depth of the tree.</w:t>
+        <w:t>I started</w:t>
+      </w:r>
+      <w:r>
+        <w:rPr>
+          <w:rFonts w:ascii="Calibri" w:hAnsi="Calibri" w:cs="Calibri"/>
+          <w:lang w:val="en-US"/>
+        </w:rPr>
+        <w:t xml:space="preserve"> off</w:t>
+      </w:r>
+      <w:r>
+        <w:rPr>
+          <w:rFonts w:ascii="Calibri" w:hAnsi="Calibri" w:cs="Calibri"/>
+        </w:rPr>
+        <w:t xml:space="preserve"> with an important parameter: max_depth which controls the depth of the tree.</w:t>
       </w:r>
       <w:r>
         <w:rPr>
@@ -684,20 +803,46 @@
         <w:rPr>
           <w:rFonts w:ascii="Calibri" w:hAnsi="Calibri" w:cs="Calibri"/>
         </w:rPr>
-        <w:t>The performance peaks at around 14, and slightly fluctuate afterwards. So setting max_depth to be 14 would be a good way to avoid overfitting.</w:t>
-      </w:r>
-    </w:p>
-    <w:p>
-      <w:pPr>
-        <w:rPr>
-          <w:rFonts w:ascii="Calibri" w:hAnsi="Calibri" w:cs="Calibri"/>
-        </w:rPr>
-      </w:pPr>
-      <w:r>
-        <w:rPr>
-          <w:rFonts w:ascii="Calibri" w:hAnsi="Calibri" w:cs="Calibri"/>
-        </w:rPr>
-        <w:t>In order to try tuning more parameters more efficiently, I self-implemented a grid search that outputs the best model and accuracy based on the given parameter space.</w:t>
+        <w:t>The performance peaks at around 14, and slightly fluctuate</w:t>
+      </w:r>
+      <w:r>
+        <w:rPr>
+          <w:rFonts w:ascii="Calibri" w:hAnsi="Calibri" w:cs="Calibri"/>
+          <w:lang w:val="en-US"/>
+        </w:rPr>
+        <w:t>s</w:t>
+      </w:r>
+      <w:r>
+        <w:rPr>
+          <w:rFonts w:ascii="Calibri" w:hAnsi="Calibri" w:cs="Calibri"/>
+        </w:rPr>
+        <w:t xml:space="preserve"> afterwards. So max_depth to be 14 would be a good way to avoid overfitting.</w:t>
+      </w:r>
+    </w:p>
+    <w:p>
+      <w:pPr>
+        <w:rPr>
+          <w:rFonts w:ascii="Calibri" w:hAnsi="Calibri" w:cs="Calibri"/>
+        </w:rPr>
+      </w:pPr>
+      <w:r>
+        <w:rPr>
+          <w:rFonts w:ascii="Calibri" w:hAnsi="Calibri" w:cs="Calibri"/>
+        </w:rPr>
+        <w:t xml:space="preserve">In order to try tuning more parameters more efficiently, I self-implemented a grid search that outputs the best model and accuracy based on </w:t>
+      </w:r>
+      <w:r>
+        <w:rPr>
+          <w:rFonts w:ascii="Calibri" w:hAnsi="Calibri" w:cs="Calibri"/>
+          <w:lang w:val="en-US"/>
+        </w:rPr>
+        <w:t>any</w:t>
+      </w:r>
+      <w:r>
+        <w:rPr>
+          <w:rFonts w:ascii="Calibri" w:hAnsi="Calibri" w:cs="Calibri"/>
+        </w:rPr>
+        <w:t xml:space="preserve"> given parameter space.</w:t>
       </w:r>
     </w:p>
     <w:p>
@@ -1347,7 +1492,28 @@
           <w:rFonts w:ascii="Calibri" w:hAnsi="Calibri" w:cs="Calibri"/>
           <w:lang w:val="en-US"/>
         </w:rPr>
-        <w:t>Try our luck on the oversampled dataset:</w:t>
+        <w:t>Then t</w:t>
+      </w:r>
+      <w:r>
+        <w:rPr>
+          <w:rFonts w:ascii="Calibri" w:hAnsi="Calibri" w:cs="Calibri"/>
+          <w:lang w:val="en-US"/>
+        </w:rPr>
+        <w:t>ry our luck</w:t>
+      </w:r>
+      <w:r>
+        <w:rPr>
+          <w:rFonts w:ascii="Calibri" w:hAnsi="Calibri" w:cs="Calibri"/>
+          <w:lang w:val="en-US"/>
+        </w:rPr>
+        <w:t xml:space="preserve"> by applying the same KNN</w:t>
+      </w:r>
+      <w:r>
+        <w:rPr>
+          <w:rFonts w:ascii="Calibri" w:hAnsi="Calibri" w:cs="Calibri"/>
+          <w:lang w:val="en-US"/>
+        </w:rPr>
+        <w:t xml:space="preserve"> on the oversampled dataset:</w:t>
       </w:r>
     </w:p>
     <w:p>
@@ -1419,7 +1585,21 @@
           <w:rFonts w:ascii="Calibri" w:hAnsi="Calibri" w:cs="Calibri"/>
           <w:lang w:val="en-US"/>
         </w:rPr>
-        <w:t xml:space="preserve"> But TPR on class 2 declined as expected.</w:t>
+        <w:t xml:space="preserve"> But TPR on class 2 declined as </w:t>
+      </w:r>
+      <w:r>
+        <w:rPr>
+          <w:rFonts w:ascii="Calibri" w:hAnsi="Calibri" w:cs="Calibri"/>
+          <w:lang w:val="en-US"/>
+        </w:rPr>
+        <w:t>well</w:t>
+      </w:r>
+      <w:r>
+        <w:rPr>
+          <w:rFonts w:ascii="Calibri" w:hAnsi="Calibri" w:cs="Calibri"/>
+          <w:lang w:val="en-US"/>
+        </w:rPr>
+        <w:t>.</w:t>
       </w:r>
       <w:r>
         <w:rPr>
@@ -1433,7 +1613,14 @@
           <w:rFonts w:ascii="Calibri" w:hAnsi="Calibri" w:cs="Calibri"/>
           <w:lang w:val="en-US"/>
         </w:rPr>
-        <w:t>comparing</w:t>
+        <w:t>compar</w:t>
+      </w:r>
+      <w:r>
+        <w:rPr>
+          <w:rFonts w:ascii="Calibri" w:hAnsi="Calibri" w:cs="Calibri"/>
+          <w:lang w:val="en-US"/>
+        </w:rPr>
+        <w:t>e</w:t>
       </w:r>
       <w:r>
         <w:rPr>
@@ -1461,7 +1648,21 @@
           <w:rFonts w:ascii="Calibri" w:hAnsi="Calibri" w:cs="Calibri"/>
           <w:lang w:val="en-US"/>
         </w:rPr>
-        <w:t>Below are two charts depicting the performance change with n_neighbors for original and oversampled dataset.</w:t>
+        <w:t xml:space="preserve">Below are two charts depicting the performance change with n_neighbors </w:t>
+      </w:r>
+      <w:r>
+        <w:rPr>
+          <w:rFonts w:ascii="Calibri" w:hAnsi="Calibri" w:cs="Calibri"/>
+          <w:lang w:val="en-US"/>
+        </w:rPr>
+        <w:t>on the</w:t>
+      </w:r>
+      <w:r>
+        <w:rPr>
+          <w:rFonts w:ascii="Calibri" w:hAnsi="Calibri" w:cs="Calibri"/>
+          <w:lang w:val="en-US"/>
+        </w:rPr>
+        <w:t xml:space="preserve"> original and oversampled dataset.</w:t>
       </w:r>
     </w:p>
     <w:tbl>
@@ -1735,34 +1936,6 @@
           <w:rFonts w:ascii="Calibri" w:hAnsi="Calibri" w:cs="Calibri"/>
           <w:lang w:val="en-US"/>
         </w:rPr>
-        <w:t>T</w:t>
-      </w:r>
-      <w:r>
-        <w:rPr>
-          <w:rFonts w:ascii="Calibri" w:hAnsi="Calibri" w:cs="Calibri"/>
-          <w:lang w:val="en-US"/>
-        </w:rPr>
-        <w:t xml:space="preserve">hat’s </w:t>
-      </w:r>
-      <w:r>
-        <w:rPr>
-          <w:rFonts w:ascii="Calibri" w:hAnsi="Calibri" w:cs="Calibri"/>
-          <w:lang w:val="en-US"/>
-        </w:rPr>
-        <w:t xml:space="preserve">also </w:t>
-      </w:r>
-      <w:r>
-        <w:rPr>
-          <w:rFonts w:ascii="Calibri" w:hAnsi="Calibri" w:cs="Calibri"/>
-          <w:lang w:val="en-US"/>
-        </w:rPr>
-        <w:t xml:space="preserve">why there’s a performance limit, </w:t>
-      </w:r>
-      <w:r>
-        <w:rPr>
-          <w:rFonts w:ascii="Calibri" w:hAnsi="Calibri" w:cs="Calibri"/>
-          <w:lang w:val="en-US"/>
-        </w:rPr>
         <w:t xml:space="preserve">While caring for more neighbors simply reduces the chance of minority classes being correctly classified, thus making it difficult to </w:t>
       </w:r>
       <w:r>
@@ -2163,8 +2336,6 @@
           <w:lang w:val="en-US"/>
         </w:rPr>
       </w:pPr>
-      <w:bookmarkStart w:id="0" w:name="_GoBack"/>
-      <w:bookmarkEnd w:id="0"/>
     </w:p>
     <w:p>
       <w:pPr>
@@ -2180,7 +2351,6 @@
           <w:iCs/>
           <w:lang w:val="en-US"/>
         </w:rPr>
-        <w:lastRenderedPageBreak/>
         <w:t xml:space="preserve">KNN: </w:t>
       </w:r>
       <w:hyperlink r:id="rId19" w:history="1">
@@ -2193,13 +2363,8 @@
           <w:t>https://github.com/telenovelachuan/data_science/blob/master/EECS_738_machine_learning/lab2/KNN.ipynb</w:t>
         </w:r>
       </w:hyperlink>
-    </w:p>
-    <w:p>
-      <w:pPr>
-        <w:rPr>
-          <w:rFonts w:ascii="Calibri" w:hAnsi="Calibri" w:cs="Calibri" w:hint="eastAsia"/>
-        </w:rPr>
-      </w:pPr>
+      <w:bookmarkStart w:id="0" w:name="_GoBack"/>
+      <w:bookmarkEnd w:id="0"/>
     </w:p>
     <w:sectPr>
       <w:pgSz w:w="11900" w:h="16840"/>
@@ -2892,6 +3057,32 @@
       <w:u w:val="single"/>
     </w:rPr>
   </w:style>
+  <w:style w:type="paragraph" w:styleId="BalloonText">
+    <w:name w:val="Balloon Text"/>
+    <w:basedOn w:val="Normal"/>
+    <w:link w:val="BalloonTextChar"/>
+    <w:uiPriority w:val="99"/>
+    <w:semiHidden/>
+    <w:unhideWhenUsed/>
+    <w:rsid w:val="003B5231"/>
+    <w:rPr>
+      <w:sz w:val="18"/>
+      <w:szCs w:val="18"/>
+    </w:rPr>
+  </w:style>
+  <w:style w:type="character" w:customStyle="1" w:styleId="BalloonTextChar">
+    <w:name w:val="Balloon Text Char"/>
+    <w:basedOn w:val="DefaultParagraphFont"/>
+    <w:link w:val="BalloonText"/>
+    <w:uiPriority w:val="99"/>
+    <w:semiHidden/>
+    <w:rsid w:val="003B5231"/>
+    <w:rPr>
+      <w:rFonts w:ascii="Times New Roman" w:eastAsia="Times New Roman" w:hAnsi="Times New Roman" w:cs="Times New Roman"/>
+      <w:sz w:val="18"/>
+      <w:szCs w:val="18"/>
+    </w:rPr>
+  </w:style>
 </w:styles>
 </file>
 

</xml_diff>